<commit_message>
Standardize brief decision flow
</commit_message>
<xml_diff>
--- a/outputs/MARACOOS_Congressional_Brief_Spread_Pathways_v2.docx
+++ b/outputs/MARACOOS_Congressional_Brief_Spread_Pathways_v2.docx
@@ -462,45 +462,74 @@
           </w:p>
         </w:tc>
       </w:tr>
+    </w:tbl>
+    <w:tbl>
+      <w:tblPr>
+        <w:tblW w:type="dxa" w:w="10627"/>
+        <w:jc w:val="center"/>
+        <w:tblLayout w:type="fixed"/>
+        <w:tblLook w:firstColumn="1" w:firstRow="1" w:lastColumn="0" w:lastRow="0" w:noHBand="0" w:noVBand="1" w:val="04A0"/>
+        <w:tblBorders>
+          <w:top w:val="nil"/>
+          <w:left w:val="nil"/>
+          <w:bottom w:val="nil"/>
+          <w:right w:val="nil"/>
+          <w:insideH w:val="nil"/>
+          <w:insideV w:val="nil"/>
+        </w:tblBorders>
+      </w:tblPr>
+      <w:tblGrid>
+        <w:gridCol w:w="2657"/>
+        <w:gridCol w:w="2657"/>
+        <w:gridCol w:w="2657"/>
+        <w:gridCol w:w="2656"/>
+      </w:tblGrid>
       <w:tr>
-        <w:trPr>
-          <w:jc w:val="center"/>
-        </w:trPr>
         <w:tc>
           <w:tcPr>
-            <w:tcW w:w="1685" w:type="dxa"/>
-            <w:shd w:val="clear" w:color="auto" w:fill="EAF5F6"/>
+            <w:tcW w:type="dxa" w:w="2657"/>
+            <w:shd w:fill="EAF5F6"/>
             <w:tcMar>
-              <w:top w:w="75" w:type="dxa"/>
-              <w:left w:w="55" w:type="dxa"/>
-              <w:bottom w:w="70" w:type="dxa"/>
-              <w:right w:w="55" w:type="dxa"/>
+              <w:top w:w="110" w:type="dxa"/>
+              <w:start w:w="95" w:type="dxa"/>
+              <w:bottom w:w="100" w:type="dxa"/>
+              <w:end w:w="95" w:type="dxa"/>
             </w:tcMar>
             <w:vAlign w:val="center"/>
           </w:tcPr>
           <w:p>
             <w:pPr>
-              <w:spacing w:after="190"/>
+              <w:spacing w:after="40"/>
               <w:jc w:val="center"/>
             </w:pPr>
+            <w:r/>
             <w:r>
               <w:rPr>
-                <w:rFonts w:eastAsia="Arial"/>
+                <w:rFonts w:ascii="Arial" w:hAnsi="Arial"/>
                 <w:b/>
                 <w:color w:val="007C89"/>
                 <w:sz w:val="16"/>
               </w:rPr>
               <w:t>OBSERVE</w:t>
             </w:r>
+            <w:r>
+              <w:rPr>
+                <w:rFonts w:ascii="Arial" w:hAnsi="Arial"/>
+                <w:b/>
+                <w:color w:val="E8A43A"/>
+                <w:sz w:val="18"/>
+              </w:rPr>
+              <w:t xml:space="preserve">  →</w:t>
+            </w:r>
           </w:p>
           <w:p>
             <w:pPr>
-              <w:spacing w:after="40" w:line="264" w:lineRule="auto"/>
+              <w:spacing w:after="0" w:line="228" w:lineRule="auto"/>
               <w:jc w:val="center"/>
             </w:pPr>
             <w:r>
               <w:rPr>
-                <w:rFonts w:eastAsia="Arial"/>
+                <w:rFonts w:ascii="Arial" w:hAnsi="Arial"/>
                 <w:color w:val="58666D"/>
                 <w:sz w:val="14"/>
               </w:rPr>
@@ -510,66 +539,49 @@
         </w:tc>
         <w:tc>
           <w:tcPr>
-            <w:tcW w:w="288" w:type="dxa"/>
+            <w:tcW w:type="dxa" w:w="2657"/>
+            <w:shd w:fill="EAF5F6"/>
             <w:tcMar>
-              <w:top w:w="75" w:type="dxa"/>
-              <w:left w:w="55" w:type="dxa"/>
-              <w:bottom w:w="70" w:type="dxa"/>
-              <w:right w:w="55" w:type="dxa"/>
+              <w:top w:w="110" w:type="dxa"/>
+              <w:start w:w="95" w:type="dxa"/>
+              <w:bottom w:w="100" w:type="dxa"/>
+              <w:end w:w="95" w:type="dxa"/>
             </w:tcMar>
             <w:vAlign w:val="center"/>
           </w:tcPr>
           <w:p>
             <w:pPr>
-              <w:spacing w:after="190"/>
+              <w:spacing w:after="40"/>
               <w:jc w:val="center"/>
             </w:pPr>
+            <w:r/>
             <w:r>
               <w:rPr>
-                <w:rFonts w:eastAsia="Arial"/>
-                <w:b/>
-                <w:color w:val="E8A43A"/>
-                <w:sz w:val="24"/>
-              </w:rPr>
-              <w:t>→</w:t>
-            </w:r>
-          </w:p>
-        </w:tc>
-        <w:tc>
-          <w:tcPr>
-            <w:tcW w:w="1685" w:type="dxa"/>
-            <w:shd w:val="clear" w:color="auto" w:fill="EAF5F6"/>
-            <w:tcMar>
-              <w:top w:w="75" w:type="dxa"/>
-              <w:left w:w="55" w:type="dxa"/>
-              <w:bottom w:w="70" w:type="dxa"/>
-              <w:right w:w="55" w:type="dxa"/>
-            </w:tcMar>
-            <w:vAlign w:val="center"/>
-          </w:tcPr>
-          <w:p>
-            <w:pPr>
-              <w:spacing w:after="190"/>
-              <w:jc w:val="center"/>
-            </w:pPr>
-            <w:r>
-              <w:rPr>
-                <w:rFonts w:eastAsia="Arial"/>
+                <w:rFonts w:ascii="Arial" w:hAnsi="Arial"/>
                 <w:b/>
                 <w:color w:val="007C89"/>
                 <w:sz w:val="16"/>
               </w:rPr>
               <w:t>CONNECT</w:t>
             </w:r>
+            <w:r>
+              <w:rPr>
+                <w:rFonts w:ascii="Arial" w:hAnsi="Arial"/>
+                <w:b/>
+                <w:color w:val="E8A43A"/>
+                <w:sz w:val="18"/>
+              </w:rPr>
+              <w:t xml:space="preserve">  →</w:t>
+            </w:r>
           </w:p>
           <w:p>
             <w:pPr>
-              <w:spacing w:after="40" w:line="264" w:lineRule="auto"/>
+              <w:spacing w:after="0" w:line="228" w:lineRule="auto"/>
               <w:jc w:val="center"/>
             </w:pPr>
             <w:r>
               <w:rPr>
-                <w:rFonts w:eastAsia="Arial"/>
+                <w:rFonts w:ascii="Arial" w:hAnsi="Arial"/>
                 <w:color w:val="58666D"/>
                 <w:sz w:val="14"/>
               </w:rPr>
@@ -579,66 +591,49 @@
         </w:tc>
         <w:tc>
           <w:tcPr>
-            <w:tcW w:w="288" w:type="dxa"/>
+            <w:tcW w:type="dxa" w:w="2657"/>
+            <w:shd w:fill="EAF5F6"/>
             <w:tcMar>
-              <w:top w:w="75" w:type="dxa"/>
-              <w:left w:w="55" w:type="dxa"/>
-              <w:bottom w:w="70" w:type="dxa"/>
-              <w:right w:w="55" w:type="dxa"/>
+              <w:top w:w="110" w:type="dxa"/>
+              <w:start w:w="95" w:type="dxa"/>
+              <w:bottom w:w="100" w:type="dxa"/>
+              <w:end w:w="95" w:type="dxa"/>
             </w:tcMar>
             <w:vAlign w:val="center"/>
           </w:tcPr>
           <w:p>
             <w:pPr>
-              <w:spacing w:after="190"/>
+              <w:spacing w:after="40"/>
               <w:jc w:val="center"/>
             </w:pPr>
+            <w:r/>
             <w:r>
               <w:rPr>
-                <w:rFonts w:eastAsia="Arial"/>
-                <w:b/>
-                <w:color w:val="E8A43A"/>
-                <w:sz w:val="24"/>
-              </w:rPr>
-              <w:t>→</w:t>
-            </w:r>
-          </w:p>
-        </w:tc>
-        <w:tc>
-          <w:tcPr>
-            <w:tcW w:w="1685" w:type="dxa"/>
-            <w:shd w:val="clear" w:color="auto" w:fill="EAF5F6"/>
-            <w:tcMar>
-              <w:top w:w="75" w:type="dxa"/>
-              <w:left w:w="55" w:type="dxa"/>
-              <w:bottom w:w="70" w:type="dxa"/>
-              <w:right w:w="55" w:type="dxa"/>
-            </w:tcMar>
-            <w:vAlign w:val="center"/>
-          </w:tcPr>
-          <w:p>
-            <w:pPr>
-              <w:spacing w:after="190"/>
-              <w:jc w:val="center"/>
-            </w:pPr>
-            <w:r>
-              <w:rPr>
-                <w:rFonts w:eastAsia="Arial"/>
+                <w:rFonts w:ascii="Arial" w:hAnsi="Arial"/>
                 <w:b/>
                 <w:color w:val="007C89"/>
                 <w:sz w:val="16"/>
               </w:rPr>
               <w:t>PREDICT</w:t>
             </w:r>
+            <w:r>
+              <w:rPr>
+                <w:rFonts w:ascii="Arial" w:hAnsi="Arial"/>
+                <w:b/>
+                <w:color w:val="E8A43A"/>
+                <w:sz w:val="18"/>
+              </w:rPr>
+              <w:t xml:space="preserve">  →</w:t>
+            </w:r>
           </w:p>
           <w:p>
             <w:pPr>
-              <w:spacing w:after="40" w:line="264" w:lineRule="auto"/>
+              <w:spacing w:after="0" w:line="228" w:lineRule="auto"/>
               <w:jc w:val="center"/>
             </w:pPr>
             <w:r>
               <w:rPr>
-                <w:rFonts w:eastAsia="Arial"/>
+                <w:rFonts w:ascii="Arial" w:hAnsi="Arial"/>
                 <w:color w:val="58666D"/>
                 <w:sz w:val="14"/>
               </w:rPr>
@@ -648,52 +643,25 @@
         </w:tc>
         <w:tc>
           <w:tcPr>
-            <w:tcW w:w="288" w:type="dxa"/>
+            <w:tcW w:type="dxa" w:w="2656"/>
+            <w:shd w:fill="EAF5F6"/>
             <w:tcMar>
-              <w:top w:w="75" w:type="dxa"/>
-              <w:left w:w="55" w:type="dxa"/>
-              <w:bottom w:w="70" w:type="dxa"/>
-              <w:right w:w="55" w:type="dxa"/>
+              <w:top w:w="110" w:type="dxa"/>
+              <w:start w:w="95" w:type="dxa"/>
+              <w:bottom w:w="100" w:type="dxa"/>
+              <w:end w:w="95" w:type="dxa"/>
             </w:tcMar>
             <w:vAlign w:val="center"/>
           </w:tcPr>
           <w:p>
             <w:pPr>
-              <w:spacing w:after="190"/>
+              <w:spacing w:after="40"/>
               <w:jc w:val="center"/>
             </w:pPr>
+            <w:r/>
             <w:r>
               <w:rPr>
-                <w:rFonts w:eastAsia="Arial"/>
-                <w:b/>
-                <w:color w:val="E8A43A"/>
-                <w:sz w:val="24"/>
-              </w:rPr>
-              <w:t>→</w:t>
-            </w:r>
-          </w:p>
-        </w:tc>
-        <w:tc>
-          <w:tcPr>
-            <w:tcW w:w="4709" w:type="dxa"/>
-            <w:gridSpan w:val="2"/>
-            <w:shd w:val="clear" w:color="auto" w:fill="EAF5F6"/>
-            <w:tcMar>
-              <w:top w:w="75" w:type="dxa"/>
-              <w:left w:w="55" w:type="dxa"/>
-              <w:bottom w:w="70" w:type="dxa"/>
-              <w:right w:w="55" w:type="dxa"/>
-            </w:tcMar>
-            <w:vAlign w:val="center"/>
-          </w:tcPr>
-          <w:p>
-            <w:pPr>
-              <w:spacing w:after="190"/>
-              <w:jc w:val="center"/>
-            </w:pPr>
-            <w:r>
-              <w:rPr>
-                <w:rFonts w:eastAsia="Arial"/>
+                <w:rFonts w:ascii="Arial" w:hAnsi="Arial"/>
                 <w:b/>
                 <w:color w:val="007C89"/>
                 <w:sz w:val="16"/>
@@ -703,12 +671,12 @@
           </w:p>
           <w:p>
             <w:pPr>
-              <w:spacing w:after="40" w:line="264" w:lineRule="auto"/>
+              <w:spacing w:after="0" w:line="228" w:lineRule="auto"/>
               <w:jc w:val="center"/>
             </w:pPr>
             <w:r>
               <w:rPr>
-                <w:rFonts w:eastAsia="Arial"/>
+                <w:rFonts w:ascii="Arial" w:hAnsi="Arial"/>
                 <w:color w:val="58666D"/>
                 <w:sz w:val="14"/>
               </w:rPr>

</xml_diff>